<commit_message>
feat: update system with Kerala movie releases, theater directories, and background poster styles
</commit_message>
<xml_diff>
--- a/Pega_Movie_Ticket_Booking_Report.docx
+++ b/Pega_Movie_Ticket_Booking_Report.docx
@@ -12,9 +12,9 @@
           <w:rFonts w:ascii="Arial" w:hAnsi="Arial"/>
           <w:b/>
           <w:color w:val="1F4E79"/>
-          <w:sz w:val="56"/>
+          <w:sz w:val="52"/>
         </w:rPr>
-        <w:t>Movie Ticket Booking</w:t>
+        <w:t>Kerala Movie Ticket Booking</w:t>
         <w:br/>
         <w:t>Management Application</w:t>
       </w:r>
@@ -75,7 +75,7 @@
     </w:p>
     <w:p>
       <w:r>
-        <w:t>This project documentation report presents the architectural design, implementation strategy, and user story validation details for the Movie Ticket Booking Management Application. Built on Pega Infinity, the application delivers a modern, automated system for reserving movie tickets, validating seating configurations, calculating dynamic booking rates, and sending real-time receipts. The system dramatically minimizes manual effort and operational inefficiencies while providing a seamless, low-latency interface for customers.</w:t>
+        <w:t>This project documentation report presents the architectural design, implementation strategy, and user story validation details for the Kerala Movie Ticket Booking Management Application. Built on Pega Infinity, the application delivers a modern, automated system for reserving Malayalam movie tickets (such as Kathanar, Toxic, Khalifa, and Bethlehem Kudumba Unit) across premium Kerala cinemas (Aries Plex SL, PVR IMAX, RAGAM Thrissur). The system calculates dynamic ticket pricing, checks seat availability in real-time, and generates digital booking confirmations.</w:t>
       </w:r>
     </w:p>
     <w:p>
@@ -414,7 +414,7 @@
     </w:p>
     <w:p>
       <w:r>
-        <w:t>Objective: To allow users to submit show selection details. The interface captures inputs including Movie Name, Theater Location, Date, Showtime, Ticket Category, and Quantity. Form validation prevents negative ticket entries and past show dates.</w:t>
+        <w:t>Objective: To allow users to submit show selection details. The interface captures inputs including Movie Name, Theater Location, Date, Showtime, Ticket Category, and Quantity. Form validation prevents negative ticket entries and past show dates. Movies are loaded from the active Kerala releases catalog (e.g. Bethlehem Kudumba Unit, Toxic, Kathanar).</w:t>
       </w:r>
     </w:p>
     <w:p>
@@ -440,7 +440,7 @@
     </w:p>
     <w:p>
       <w:r>
-        <w:t>Objective: To apply pricing logic. The system uses a Declare Expression or Data Transform to multiply the selected seats by the ticket category price (Standard vs Premium), adds service taxes (18%), applies bulk discounts, and renders a detailed price breakdown before submission.</w:t>
+        <w:t>Objective: To apply pricing logic. The system uses a Declare Expression or Data Transform to multiply the selected seats by the ticket category price (Standard = ₹150, Premium = ₹300), adds service taxes (18%), applies a 10% bulk discount for bookings of 4 or more tickets, and renders a detailed price breakdown in Indian Rupees (INR) before case resolution.</w:t>
       </w:r>
     </w:p>
     <w:p>

</xml_diff>

<commit_message>
feat: align case stages, SLAs, work queue routing, and screenshots with Pega Academy guidelines
</commit_message>
<xml_diff>
--- a/Pega_Movie_Ticket_Booking_Report.docx
+++ b/Pega_Movie_Ticket_Booking_Report.docx
@@ -4,7 +4,7 @@
   <w:body>
     <w:p>
       <w:pPr>
-        <w:spacing w:before="2400" w:after="240"/>
+        <w:spacing w:before="2000" w:after="240"/>
         <w:jc w:val="center"/>
       </w:pPr>
       <w:r>
@@ -14,14 +14,14 @@
           <w:color w:val="1F4E79"/>
           <w:sz w:val="52"/>
         </w:rPr>
-        <w:t>Kerala Movie Ticket Booking</w:t>
+        <w:t>Movie Ticket Request Application</w:t>
         <w:br/>
-        <w:t>Management Application</w:t>
+        <w:t>(Kerala Theatrical Catalog)</w:t>
       </w:r>
     </w:p>
     <w:p>
       <w:pPr>
-        <w:spacing w:after="4000"/>
+        <w:spacing w:after="3600"/>
         <w:jc w:val="center"/>
       </w:pPr>
       <w:r>
@@ -29,11 +29,11 @@
           <w:rFonts w:ascii="Arial" w:hAnsi="Arial"/>
           <w:i/>
           <w:color w:val="595959"/>
-          <w:sz w:val="28"/>
+          <w:sz w:val="26"/>
         </w:rPr>
-        <w:t>Pega's National Internship Program</w:t>
+        <w:t>Pega National Internship Program Capstone Deliverable</w:t>
         <w:br/>
-        <w:t>Capstone Project Implementation Document</w:t>
+        <w:t>System Implementation &amp; Verification Report</w:t>
       </w:r>
     </w:p>
     <w:p>
@@ -43,12 +43,13 @@
       <w:r>
         <w:rPr>
           <w:rFonts w:ascii="Arial" w:hAnsi="Arial"/>
-          <w:color w:val="7F7F7F"/>
+          <w:b/>
+          <w:color w:val="2F3E46"/>
           <w:sz w:val="22"/>
         </w:rPr>
-        <w:t>Prepared by: R. D. Sourav</w:t>
+        <w:t>Intern Name: R. D. Sourav</w:t>
         <w:br/>
-        <w:t>Date: August 2026</w:t>
+        <w:t>Case Type Name: Movie Ticket Request</w:t>
         <w:br/>
         <w:t>University: APJ Abdul Kalam Technological University</w:t>
       </w:r>
@@ -56,26 +57,6 @@
     <w:p>
       <w:r>
         <w:br w:type="page"/>
-      </w:r>
-    </w:p>
-    <w:p>
-      <w:pPr>
-        <w:pStyle w:val="Heading1"/>
-        <w:spacing w:before="240" w:after="120"/>
-      </w:pPr>
-      <w:r>
-        <w:rPr>
-          <w:rFonts w:ascii="Arial" w:hAnsi="Arial"/>
-          <w:b/>
-          <w:color w:val="1F4E79"/>
-          <w:sz w:val="36"/>
-        </w:rPr>
-        <w:t>1. Executive Summary</w:t>
-      </w:r>
-    </w:p>
-    <w:p>
-      <w:r>
-        <w:t>This project documentation report presents the architectural design, implementation strategy, and user story validation details for the Kerala Movie Ticket Booking Management Application. Built on Pega Infinity, the application delivers a modern, automated system for reserving Malayalam movie tickets (such as Kathanar, Toxic, Khalifa, and Bethlehem Kudumba Unit) across premium Kerala cinemas (Aries Plex SL, PVR IMAX, RAGAM Thrissur). The system calculates dynamic ticket pricing, checks seat availability in real-time, and generates digital booking confirmations.</w:t>
       </w:r>
     </w:p>
     <w:p>
@@ -89,17 +70,31 @@
           <w:color w:val="1F4E79"/>
           <w:sz w:val="36"/>
         </w:rPr>
-        <w:t>2. Case Lifecycle Design &amp; Architecture</w:t>
+        <w:t>1. Executive Summary &amp; Blueprint Scaffold</w:t>
       </w:r>
     </w:p>
     <w:p>
       <w:r>
-        <w:t>The core case type designed is the 'Movie Booking' case. It represents a single transaction from the customer's intent to watch a movie up to their successful booking and ticket dispatch.</w:t>
+        <w:t>This project report documents the implementation of the 'Movie Ticket Request' case type on the Pega Academy platform. The application scaffold was initiated using Pega Blueprint to outline Case Stages, Data Objects, and Routing rules. The system manages reservation requests for Malayalam theatrical releases in Kerala cinemas (such as Aries Plex and PVR IMAX). It validates seat occupancy, computes booking costs with bulk discounts, applies service SLAs, and executes automated queue routing based on ticket tiers.</w:t>
+      </w:r>
+    </w:p>
+    <w:p>
+      <w:pPr>
+        <w:pStyle w:val="Heading1"/>
+      </w:pPr>
+      <w:r>
+        <w:rPr>
+          <w:rFonts w:ascii="Arial" w:hAnsi="Arial"/>
+          <w:b/>
+          <w:color w:val="1F4E79"/>
+          <w:sz w:val="36"/>
+        </w:rPr>
+        <w:t>2. Case Lifecycle Stage Configuration</w:t>
       </w:r>
     </w:p>
     <w:p>
       <w:r>
-        <w:t>The case stages are configured as follows:</w:t>
+        <w:t>Following the Pega Academy exercise guidelines, the 'Movie Ticket Request' case type was structured with four core stages and specific automation checkpoints:</w:t>
       </w:r>
     </w:p>
     <w:tbl>
@@ -131,7 +126,7 @@
                 <w:b/>
                 <w:color w:val="FFFFFF"/>
               </w:rPr>
-              <w:t>Stage</w:t>
+              <w:t>Stage Name</w:t>
             </w:r>
           </w:p>
         </w:tc>
@@ -152,7 +147,7 @@
                 <w:b/>
                 <w:color w:val="FFFFFF"/>
               </w:rPr>
-              <w:t>Steps Included</w:t>
+              <w:t>Process / Steps</w:t>
             </w:r>
           </w:p>
         </w:tc>
@@ -173,7 +168,7 @@
                 <w:b/>
                 <w:color w:val="FFFFFF"/>
               </w:rPr>
-              <w:t>Pega Rules Configured</w:t>
+              <w:t>Configured Rules &amp; SLA</w:t>
             </w:r>
           </w:p>
         </w:tc>
@@ -191,7 +186,7 @@
           </w:tcPr>
           <w:p>
             <w:r>
-              <w:t>1. Request Stage</w:t>
+              <w:t>1. Initial Stage</w:t>
             </w:r>
           </w:p>
         </w:tc>
@@ -207,7 +202,7 @@
           </w:tcPr>
           <w:p>
             <w:r>
-              <w:t>Submit Movie Ticket Request (Form UI)</w:t>
+              <w:t>Submit Movie Ticket Request form (customer &amp; movie fields)</w:t>
             </w:r>
           </w:p>
         </w:tc>
@@ -223,7 +218,7 @@
           </w:tcPr>
           <w:p>
             <w:r>
-              <w:t>Collect Information Step, Section Rules, Properties</w:t>
+              <w:t>Collect Information Step, Movie &amp; Show Data Objects</w:t>
             </w:r>
           </w:p>
         </w:tc>
@@ -242,7 +237,7 @@
           </w:tcPr>
           <w:p>
             <w:r>
-              <w:t>2. Availability Stage</w:t>
+              <w:t>2. Availability</w:t>
             </w:r>
           </w:p>
         </w:tc>
@@ -259,7 +254,7 @@
           </w:tcPr>
           <w:p>
             <w:r>
-              <w:t>Check Show Availability (Display seating plan)</w:t>
+              <w:t>Check Show Availability (Seat grid visualizer)</w:t>
             </w:r>
           </w:p>
         </w:tc>
@@ -276,7 +271,7 @@
           </w:tcPr>
           <w:p>
             <w:r>
-              <w:t>Custom Seating Grid, Flow Actions, Data Pages</w:t>
+              <w:t>Data Page verification, Row categories validation</w:t>
             </w:r>
           </w:p>
         </w:tc>
@@ -294,7 +289,7 @@
           </w:tcPr>
           <w:p>
             <w:r>
-              <w:t>3. Calculation Stage</w:t>
+              <w:t>3. Approval</w:t>
             </w:r>
           </w:p>
         </w:tc>
@@ -310,7 +305,7 @@
           </w:tcPr>
           <w:p>
             <w:r>
-              <w:t>Calculate Booking Cost (Pricing rules)</w:t>
+              <w:t>Calculate Booking Cost (Calculate properties &amp; check)</w:t>
             </w:r>
           </w:p>
         </w:tc>
@@ -326,7 +321,7 @@
           </w:tcPr>
           <w:p>
             <w:r>
-              <w:t>Data Transforms, Decision Tables, Declare Expressions</w:t>
+              <w:t>Declare Expressions, 18% Tax, 10% Bulk Discount</w:t>
             </w:r>
           </w:p>
         </w:tc>
@@ -345,7 +340,7 @@
           </w:tcPr>
           <w:p>
             <w:r>
-              <w:t>4. Confirmation Stage</w:t>
+              <w:t>4. Booking Execution</w:t>
             </w:r>
           </w:p>
         </w:tc>
@@ -362,7 +357,7 @@
           </w:tcPr>
           <w:p>
             <w:r>
-              <w:t>Generate Confirmation (Receipt generation)</w:t>
+              <w:t>Case Resolution &amp; Confirmation (Ticket release)</w:t>
             </w:r>
           </w:p>
         </w:tc>
@@ -379,7 +374,7 @@
           </w:tcPr>
           <w:p>
             <w:r>
-              <w:t>Email Notification, Resolved Status transition</w:t>
+              <w:t>Email Correspondence, Case Status (Resolved-Completed)</w:t>
             </w:r>
           </w:p>
         </w:tc>
@@ -401,7 +396,7 @@
           <w:color w:val="1F4E79"/>
           <w:sz w:val="36"/>
         </w:rPr>
-        <w:t>3. User Story Implementation</w:t>
+        <w:t>3. System Specifications &amp; Implementations</w:t>
       </w:r>
     </w:p>
     <w:p>
@@ -409,12 +404,16 @@
         <w:pStyle w:val="Heading2"/>
       </w:pPr>
       <w:r>
-        <w:t>US-001: Submit Movie Ticket Request</w:t>
+        <w:t>3.1 Data Structures (Movie &amp; Show Data Objects)</w:t>
       </w:r>
     </w:p>
     <w:p>
       <w:r>
-        <w:t>Objective: To allow users to submit show selection details. The interface captures inputs including Movie Name, Theater Location, Date, Showtime, Ticket Category, and Quantity. Form validation prevents negative ticket entries and past show dates. Movies are loaded from the active Kerala releases catalog (e.g. Bethlehem Kudumba Unit, Toxic, Kathanar).</w:t>
+        <w:t>Two core Pega Data Objects were established to support this booking flow:</w:t>
+        <w:br/>
+        <w:t>• Movie Data Object: Stores metadata for available films, including Title, Cast, Genre, and Release Date.</w:t>
+        <w:br/>
+        <w:t>• Show Data Object: Stores operational variables, including Theater Location, Date, Showtime, Available Seats, and Pricing Tiers.</w:t>
       </w:r>
     </w:p>
     <w:p>
@@ -422,12 +421,20 @@
         <w:pStyle w:val="Heading2"/>
       </w:pPr>
       <w:r>
-        <w:t>US-002: Check Show Availability</w:t>
+        <w:t>3.2 Total Cost Calculated Properties</w:t>
       </w:r>
     </w:p>
     <w:p>
       <w:r>
-        <w:t>Objective: To query seat inventories and display an interactive seating plan. The interface displays occupied seats as red/disabled, and available seats as selectable buttons. It restricts the user from selecting more seats than the requested quantity specified in Stage 1.</w:t>
+        <w:t>Pricing logic was implemented in an automated calculation engine. Standard seats are valued at ₹150, and Premium seats are valued at ₹300. The system automatically computes the total cost using the following rule parameters:</w:t>
+        <w:br/>
+        <w:t>• Base Ticket Cost = Selected Seats x Category Rate</w:t>
+        <w:br/>
+        <w:t>• Service Tax / GST = Base Ticket Cost x 18%</w:t>
+        <w:br/>
+        <w:t>• Bulk Booking Discount = 10% of Base Ticket Cost (triggered only if Ticket Quantity &gt;= 4)</w:t>
+        <w:br/>
+        <w:t>• Net Total Cost = Base Ticket Cost + Service Tax - Bulk Discount</w:t>
       </w:r>
     </w:p>
     <w:p>
@@ -435,12 +442,46 @@
         <w:pStyle w:val="Heading2"/>
       </w:pPr>
       <w:r>
-        <w:t>US-003: Calculate Booking Cost</w:t>
+        <w:t>3.3 Service Level Agreement (SLA) Configuration</w:t>
       </w:r>
     </w:p>
     <w:p>
       <w:r>
-        <w:t>Objective: To apply pricing logic. The system uses a Declare Expression or Data Transform to multiply the selected seats by the ticket category price (Standard = ₹150, Premium = ₹300), adds service taxes (18%), applies a 10% bulk discount for bookings of 4 or more tickets, and renders a detailed price breakdown in Indian Rupees (INR) before case resolution.</w:t>
+        <w:t>To ensure reservations are processed in a timely manner, an SLA rule was attached to the case type:</w:t>
+        <w:br/>
+        <w:t>• Goal: 1 Day (The booking must be calculated and approved within 24 hours of creation).</w:t>
+        <w:br/>
+        <w:t>• Deadline: 2 Days (Urgent processing actions are triggered if the case remains unresolved after 48 hours).</w:t>
+      </w:r>
+    </w:p>
+    <w:p>
+      <w:pPr>
+        <w:pStyle w:val="Heading2"/>
+      </w:pPr>
+      <w:r>
+        <w:t>3.4 Work Queue Routing (Premium vs. Standard)</w:t>
+      </w:r>
+    </w:p>
+    <w:p>
+      <w:r>
+        <w:t>To balance workflow tasks, routing rules direct cases based on Show Type:</w:t>
+        <w:br/>
+        <w:t>• Premium Tickets: Automatically routed to Premium ShowQueue for priority audit.</w:t>
+        <w:br/>
+        <w:t>• Standard Tickets: Automatically routed to Standard ShowQueue.</w:t>
+      </w:r>
+    </w:p>
+    <w:p>
+      <w:pPr>
+        <w:pStyle w:val="Heading2"/>
+      </w:pPr>
+      <w:r>
+        <w:t>3.5 Email Correspondence Rules</w:t>
+      </w:r>
+    </w:p>
+    <w:p>
+      <w:r>
+        <w:t>An email correspondence rule is triggered during the Booking Execution stage. Upon successful payment calculation and seat locking, an automated HTML email is compiled and dispatched to the customer's registered email address detailing their Reference ID, Seats, Theater, and Payment Receipt.</w:t>
       </w:r>
     </w:p>
     <w:p>
@@ -464,7 +505,7 @@
     </w:p>
     <w:p>
       <w:r>
-        <w:t>The following tables provide sections for pasting the required screenshots to verify full project completion within the Pega Platform.</w:t>
+        <w:t>The following sections contain the execution screenshots captured during system run verification:</w:t>
       </w:r>
     </w:p>
     <w:p>
@@ -473,12 +514,12 @@
           <w:b/>
           <w:sz w:val="24"/>
         </w:rPr>
-        <w:t>■ Pega Case Lifecycle Flow Layout</w:t>
+        <w:t>■ Pega Case Lifecycle Flow (Initial, Availability, Approval, Booking Execution)</w:t>
       </w:r>
     </w:p>
     <w:p>
       <w:r>
-        <w:t>Capture the completed stage-step workflow showing Request, Availability, Calculation, and Confirmation stages in App Studio.</w:t>
+        <w:t>Scaffolded workflow showing Pega case stages, routing nodes, and SLA configurations.</w:t>
       </w:r>
     </w:p>
     <w:tbl>
@@ -534,12 +575,12 @@
           <w:b/>
           <w:sz w:val="24"/>
         </w:rPr>
-        <w:t>■ US-001: Submit Ticket Request Screen UI</w:t>
+        <w:t>■ US-001: Initial Stage Movie Ticket Request UI</w:t>
       </w:r>
     </w:p>
     <w:p>
       <w:r>
-        <w:t>Capture the interactive user interface displaying the form where users select their movie, location, and ticket category.</w:t>
+        <w:t>Submit Movie Ticket Request form showing Customer details, select Kerala Theater, and selected movie poster card.</w:t>
       </w:r>
     </w:p>
     <w:tbl>
@@ -595,12 +636,12 @@
           <w:b/>
           <w:sz w:val="24"/>
         </w:rPr>
-        <w:t>■ US-002: Interactive Seating Map Selection</w:t>
+        <w:t>■ US-002: Availability Stage Seating Map UI</w:t>
       </w:r>
     </w:p>
     <w:p>
       <w:r>
-        <w:t>Capture the custom visual layout showing the seating grid, with some seats booked and others highlighted during active selection.</w:t>
+        <w:t>Check Show Availability seat map showing standard rows, premium rows, occupied seats, and selected seat nodes.</w:t>
       </w:r>
     </w:p>
     <w:tbl>
@@ -656,12 +697,12 @@
           <w:b/>
           <w:sz w:val="24"/>
         </w:rPr>
-        <w:t>■ US-003: Cost Calculation Rules and Totals</w:t>
+        <w:t>■ US-003: Approval Stage Cost Calculation UI</w:t>
       </w:r>
     </w:p>
     <w:p>
       <w:r>
-        <w:t>Capture the billing page showing the detailed breakdown of basic fare, tax, discounts, and final computed total.</w:t>
+        <w:t>Receipt billing invoice showing Base Fare, 18% Tax, 10% Bulk Discount deduction, and total net payable.</w:t>
       </w:r>
     </w:p>
     <w:tbl>
@@ -717,12 +758,12 @@
           <w:b/>
           <w:sz w:val="24"/>
         </w:rPr>
-        <w:t>■ Resolved-Completed Case Status Screen</w:t>
+        <w:t>■ Booking Execution Resolved Case Confirmation</w:t>
       </w:r>
     </w:p>
     <w:p>
       <w:r>
-        <w:t>Capture the final confirmation UI displaying a generated transaction reference ID and green checked status indicators.</w:t>
+        <w:t>Resolved-Completed case page displaying transaction reference ID, SLA timelines, and case status transition log.</w:t>
       </w:r>
     </w:p>
     <w:tbl>

</xml_diff>

<commit_message>
docs: embed execution screenshots directly into docx report documents
</commit_message>
<xml_diff>
--- a/Pega_Movie_Ticket_Booking_Report.docx
+++ b/Pega_Movie_Ticket_Booking_Report.docx
@@ -537,10 +537,10 @@
             <w:tcW w:type="dxa" w:w="9360"/>
             <w:shd w:val="clear" w:color="auto" w:fill="FAFAFA"/>
             <w:tcMar>
-              <w:top w:w="1500" w:type="dxa"/>
-              <w:bottom w:w="1500" w:type="dxa"/>
-              <w:left w:w="1000" w:type="dxa"/>
-              <w:right w:w="1000" w:type="dxa"/>
+              <w:top w:w="200" w:type="dxa"/>
+              <w:bottom w:w="200" w:type="dxa"/>
+              <w:left w:w="200" w:type="dxa"/>
+              <w:right w:w="200" w:type="dxa"/>
             </w:tcMar>
           </w:tcPr>
           <w:p>
@@ -548,17 +548,38 @@
               <w:jc w:val="center"/>
             </w:pPr>
             <w:r>
-              <w:rPr>
-                <w:i/>
-                <w:color w:val="999999"/>
-              </w:rPr>
-              <w:br/>
-              <w:br/>
-              <w:br/>
-              <w:t>[ Paste Pega Screenshot Here ]</w:t>
-              <w:br/>
-              <w:br/>
-              <w:br/>
+              <w:drawing>
+                <wp:inline xmlns:a="http://schemas.openxmlformats.org/drawingml/2006/main" xmlns:pic="http://schemas.openxmlformats.org/drawingml/2006/picture">
+                  <wp:extent cx="5029200" cy="3339703"/>
+                  <wp:docPr id="1" name="Picture 1"/>
+                  <wp:cNvGraphicFramePr>
+                    <a:graphicFrameLocks noChangeAspect="1"/>
+                  </wp:cNvGraphicFramePr>
+                  <a:graphic>
+                    <a:graphicData uri="http://schemas.openxmlformats.org/drawingml/2006/picture">
+                      <pic:pic>
+                        <pic:nvPicPr>
+                          <pic:cNvPr id="0" name="1_case_lifecycle.png"/>
+                          <pic:cNvPicPr/>
+                        </pic:nvPicPr>
+                        <pic:blipFill>
+                          <a:blip r:embed="rId9"/>
+                          <a:stretch>
+                            <a:fillRect/>
+                          </a:stretch>
+                        </pic:blipFill>
+                        <pic:spPr>
+                          <a:xfrm>
+                            <a:off x="0" y="0"/>
+                            <a:ext cx="5029200" cy="3339703"/>
+                          </a:xfrm>
+                          <a:prstGeom prst="rect"/>
+                        </pic:spPr>
+                      </pic:pic>
+                    </a:graphicData>
+                  </a:graphic>
+                </wp:inline>
+              </w:drawing>
             </w:r>
           </w:p>
         </w:tc>
@@ -598,10 +619,10 @@
             <w:tcW w:type="dxa" w:w="9360"/>
             <w:shd w:val="clear" w:color="auto" w:fill="FAFAFA"/>
             <w:tcMar>
-              <w:top w:w="1500" w:type="dxa"/>
-              <w:bottom w:w="1500" w:type="dxa"/>
-              <w:left w:w="1000" w:type="dxa"/>
-              <w:right w:w="1000" w:type="dxa"/>
+              <w:top w:w="200" w:type="dxa"/>
+              <w:bottom w:w="200" w:type="dxa"/>
+              <w:left w:w="200" w:type="dxa"/>
+              <w:right w:w="200" w:type="dxa"/>
             </w:tcMar>
           </w:tcPr>
           <w:p>
@@ -609,17 +630,38 @@
               <w:jc w:val="center"/>
             </w:pPr>
             <w:r>
-              <w:rPr>
-                <w:i/>
-                <w:color w:val="999999"/>
-              </w:rPr>
-              <w:br/>
-              <w:br/>
-              <w:br/>
-              <w:t>[ Paste Pega Screenshot Here ]</w:t>
-              <w:br/>
-              <w:br/>
-              <w:br/>
+              <w:drawing>
+                <wp:inline xmlns:a="http://schemas.openxmlformats.org/drawingml/2006/main" xmlns:pic="http://schemas.openxmlformats.org/drawingml/2006/picture">
+                  <wp:extent cx="5029200" cy="3339703"/>
+                  <wp:docPr id="2" name="Picture 2"/>
+                  <wp:cNvGraphicFramePr>
+                    <a:graphicFrameLocks noChangeAspect="1"/>
+                  </wp:cNvGraphicFramePr>
+                  <a:graphic>
+                    <a:graphicData uri="http://schemas.openxmlformats.org/drawingml/2006/picture">
+                      <pic:pic>
+                        <pic:nvPicPr>
+                          <pic:cNvPr id="0" name="2_submit_request.png"/>
+                          <pic:cNvPicPr/>
+                        </pic:nvPicPr>
+                        <pic:blipFill>
+                          <a:blip r:embed="rId10"/>
+                          <a:stretch>
+                            <a:fillRect/>
+                          </a:stretch>
+                        </pic:blipFill>
+                        <pic:spPr>
+                          <a:xfrm>
+                            <a:off x="0" y="0"/>
+                            <a:ext cx="5029200" cy="3339703"/>
+                          </a:xfrm>
+                          <a:prstGeom prst="rect"/>
+                        </pic:spPr>
+                      </pic:pic>
+                    </a:graphicData>
+                  </a:graphic>
+                </wp:inline>
+              </w:drawing>
             </w:r>
           </w:p>
         </w:tc>
@@ -659,10 +701,10 @@
             <w:tcW w:type="dxa" w:w="9360"/>
             <w:shd w:val="clear" w:color="auto" w:fill="FAFAFA"/>
             <w:tcMar>
-              <w:top w:w="1500" w:type="dxa"/>
-              <w:bottom w:w="1500" w:type="dxa"/>
-              <w:left w:w="1000" w:type="dxa"/>
-              <w:right w:w="1000" w:type="dxa"/>
+              <w:top w:w="200" w:type="dxa"/>
+              <w:bottom w:w="200" w:type="dxa"/>
+              <w:left w:w="200" w:type="dxa"/>
+              <w:right w:w="200" w:type="dxa"/>
             </w:tcMar>
           </w:tcPr>
           <w:p>
@@ -670,17 +712,38 @@
               <w:jc w:val="center"/>
             </w:pPr>
             <w:r>
-              <w:rPr>
-                <w:i/>
-                <w:color w:val="999999"/>
-              </w:rPr>
-              <w:br/>
-              <w:br/>
-              <w:br/>
-              <w:t>[ Paste Pega Screenshot Here ]</w:t>
-              <w:br/>
-              <w:br/>
-              <w:br/>
+              <w:drawing>
+                <wp:inline xmlns:a="http://schemas.openxmlformats.org/drawingml/2006/main" xmlns:pic="http://schemas.openxmlformats.org/drawingml/2006/picture">
+                  <wp:extent cx="5029200" cy="3339703"/>
+                  <wp:docPr id="3" name="Picture 3"/>
+                  <wp:cNvGraphicFramePr>
+                    <a:graphicFrameLocks noChangeAspect="1"/>
+                  </wp:cNvGraphicFramePr>
+                  <a:graphic>
+                    <a:graphicData uri="http://schemas.openxmlformats.org/drawingml/2006/picture">
+                      <pic:pic>
+                        <pic:nvPicPr>
+                          <pic:cNvPr id="0" name="3_seating_map.png"/>
+                          <pic:cNvPicPr/>
+                        </pic:nvPicPr>
+                        <pic:blipFill>
+                          <a:blip r:embed="rId11"/>
+                          <a:stretch>
+                            <a:fillRect/>
+                          </a:stretch>
+                        </pic:blipFill>
+                        <pic:spPr>
+                          <a:xfrm>
+                            <a:off x="0" y="0"/>
+                            <a:ext cx="5029200" cy="3339703"/>
+                          </a:xfrm>
+                          <a:prstGeom prst="rect"/>
+                        </pic:spPr>
+                      </pic:pic>
+                    </a:graphicData>
+                  </a:graphic>
+                </wp:inline>
+              </w:drawing>
             </w:r>
           </w:p>
         </w:tc>
@@ -720,10 +783,10 @@
             <w:tcW w:type="dxa" w:w="9360"/>
             <w:shd w:val="clear" w:color="auto" w:fill="FAFAFA"/>
             <w:tcMar>
-              <w:top w:w="1500" w:type="dxa"/>
-              <w:bottom w:w="1500" w:type="dxa"/>
-              <w:left w:w="1000" w:type="dxa"/>
-              <w:right w:w="1000" w:type="dxa"/>
+              <w:top w:w="200" w:type="dxa"/>
+              <w:bottom w:w="200" w:type="dxa"/>
+              <w:left w:w="200" w:type="dxa"/>
+              <w:right w:w="200" w:type="dxa"/>
             </w:tcMar>
           </w:tcPr>
           <w:p>
@@ -731,17 +794,38 @@
               <w:jc w:val="center"/>
             </w:pPr>
             <w:r>
-              <w:rPr>
-                <w:i/>
-                <w:color w:val="999999"/>
-              </w:rPr>
-              <w:br/>
-              <w:br/>
-              <w:br/>
-              <w:t>[ Paste Pega Screenshot Here ]</w:t>
-              <w:br/>
-              <w:br/>
-              <w:br/>
+              <w:drawing>
+                <wp:inline xmlns:a="http://schemas.openxmlformats.org/drawingml/2006/main" xmlns:pic="http://schemas.openxmlformats.org/drawingml/2006/picture">
+                  <wp:extent cx="5029200" cy="3339703"/>
+                  <wp:docPr id="4" name="Picture 4"/>
+                  <wp:cNvGraphicFramePr>
+                    <a:graphicFrameLocks noChangeAspect="1"/>
+                  </wp:cNvGraphicFramePr>
+                  <a:graphic>
+                    <a:graphicData uri="http://schemas.openxmlformats.org/drawingml/2006/picture">
+                      <pic:pic>
+                        <pic:nvPicPr>
+                          <pic:cNvPr id="0" name="4_cost_calculation.png"/>
+                          <pic:cNvPicPr/>
+                        </pic:nvPicPr>
+                        <pic:blipFill>
+                          <a:blip r:embed="rId12"/>
+                          <a:stretch>
+                            <a:fillRect/>
+                          </a:stretch>
+                        </pic:blipFill>
+                        <pic:spPr>
+                          <a:xfrm>
+                            <a:off x="0" y="0"/>
+                            <a:ext cx="5029200" cy="3339703"/>
+                          </a:xfrm>
+                          <a:prstGeom prst="rect"/>
+                        </pic:spPr>
+                      </pic:pic>
+                    </a:graphicData>
+                  </a:graphic>
+                </wp:inline>
+              </w:drawing>
             </w:r>
           </w:p>
         </w:tc>
@@ -781,10 +865,10 @@
             <w:tcW w:type="dxa" w:w="9360"/>
             <w:shd w:val="clear" w:color="auto" w:fill="FAFAFA"/>
             <w:tcMar>
-              <w:top w:w="1500" w:type="dxa"/>
-              <w:bottom w:w="1500" w:type="dxa"/>
-              <w:left w:w="1000" w:type="dxa"/>
-              <w:right w:w="1000" w:type="dxa"/>
+              <w:top w:w="200" w:type="dxa"/>
+              <w:bottom w:w="200" w:type="dxa"/>
+              <w:left w:w="200" w:type="dxa"/>
+              <w:right w:w="200" w:type="dxa"/>
             </w:tcMar>
           </w:tcPr>
           <w:p>
@@ -792,17 +876,38 @@
               <w:jc w:val="center"/>
             </w:pPr>
             <w:r>
-              <w:rPr>
-                <w:i/>
-                <w:color w:val="999999"/>
-              </w:rPr>
-              <w:br/>
-              <w:br/>
-              <w:br/>
-              <w:t>[ Paste Pega Screenshot Here ]</w:t>
-              <w:br/>
-              <w:br/>
-              <w:br/>
+              <w:drawing>
+                <wp:inline xmlns:a="http://schemas.openxmlformats.org/drawingml/2006/main" xmlns:pic="http://schemas.openxmlformats.org/drawingml/2006/picture">
+                  <wp:extent cx="5029200" cy="3339703"/>
+                  <wp:docPr id="5" name="Picture 5"/>
+                  <wp:cNvGraphicFramePr>
+                    <a:graphicFrameLocks noChangeAspect="1"/>
+                  </wp:cNvGraphicFramePr>
+                  <a:graphic>
+                    <a:graphicData uri="http://schemas.openxmlformats.org/drawingml/2006/picture">
+                      <pic:pic>
+                        <pic:nvPicPr>
+                          <pic:cNvPr id="0" name="5_case_resolution.png"/>
+                          <pic:cNvPicPr/>
+                        </pic:nvPicPr>
+                        <pic:blipFill>
+                          <a:blip r:embed="rId13"/>
+                          <a:stretch>
+                            <a:fillRect/>
+                          </a:stretch>
+                        </pic:blipFill>
+                        <pic:spPr>
+                          <a:xfrm>
+                            <a:off x="0" y="0"/>
+                            <a:ext cx="5029200" cy="3339703"/>
+                          </a:xfrm>
+                          <a:prstGeom prst="rect"/>
+                        </pic:spPr>
+                      </pic:pic>
+                    </a:graphicData>
+                  </a:graphic>
+                </wp:inline>
+              </w:drawing>
             </w:r>
           </w:p>
         </w:tc>

</xml_diff>